<commit_message>
Revert "Generated Final Report"
This reverts commit 757fac4d8dcaddd5af37beec8917c84454111363.
</commit_message>
<xml_diff>
--- a/Big_Data_Report.docx
+++ b/Big_Data_Report.docx
@@ -13,26 +13,7 @@
     </w:p>
     <w:p>
       <w:pPr>
-        <w:spacing w:after="0" w:line="240" w:lineRule="auto"/>
         <w:jc w:val="center"/>
-        <w:rPr>
-          <w:sz w:val="16"/>
-        </w:rPr>
-        <w:sectPr>
-          <w:pgSz w:w="11906" w:h="16838"/>
-          <w:pgMar w:top="1417" w:right="1417" w:bottom="1417" w:left="1417" w:header="720" w:footer="720" w:gutter="0"/>
-          <w:cols w:space="720"/>
-          <w:docGrid w:linePitch="360"/>
-        </w:sectPr>
-      </w:pPr>
-    </w:p>
-    <w:p>
-      <w:pPr>
-        <w:spacing w:after="0" w:line="240" w:lineRule="auto"/>
-        <w:jc w:val="center"/>
-        <w:rPr>
-          <w:sz w:val="16"/>
-        </w:rPr>
       </w:pPr>
       <w:r>
         <w:rPr>
@@ -40,142 +21,6 @@
         </w:rPr>
         <w:t>Monish Sinha</w:t>
       </w:r>
-      <w:r>
-        <w:t xml:space="preserve"> [</w:t>
-      </w:r>
-      <w:r>
-        <w:rPr>
-          <w:sz w:val="16"/>
-        </w:rPr>
-        <w:t>25283945</w:t>
-      </w:r>
-      <w:r>
-        <w:rPr>
-          <w:sz w:val="16"/>
-        </w:rPr>
-        <w:t>]</w:t>
-      </w:r>
-    </w:p>
-    <w:p>
-      <w:pPr>
-        <w:spacing w:after="0" w:line="240" w:lineRule="auto"/>
-        <w:jc w:val="center"/>
-        <w:rPr>
-          <w:sz w:val="16"/>
-        </w:rPr>
-      </w:pPr>
-      <w:r>
-        <w:rPr>
-          <w:sz w:val="16"/>
-        </w:rPr>
-        <w:t xml:space="preserve"> James Kavanagh</w:t>
-      </w:r>
-      <w:r>
-        <w:rPr>
-          <w:sz w:val="16"/>
-        </w:rPr>
-        <w:t xml:space="preserve"> [</w:t>
-      </w:r>
-      <w:r>
-        <w:rPr>
-          <w:sz w:val="16"/>
-        </w:rPr>
-        <w:t>16515816</w:t>
-      </w:r>
-      <w:r>
-        <w:rPr>
-          <w:sz w:val="16"/>
-        </w:rPr>
-        <w:t>]</w:t>
-      </w:r>
-    </w:p>
-    <w:p>
-      <w:pPr>
-        <w:spacing w:after="0" w:line="240" w:lineRule="auto"/>
-        <w:jc w:val="center"/>
-        <w:rPr>
-          <w:sz w:val="16"/>
-        </w:rPr>
-      </w:pPr>
-      <w:r>
-        <w:rPr>
-          <w:sz w:val="16"/>
-        </w:rPr>
-        <w:t xml:space="preserve"> Cormac Kehoe</w:t>
-      </w:r>
-      <w:r>
-        <w:rPr>
-          <w:sz w:val="16"/>
-        </w:rPr>
-        <w:t xml:space="preserve"> [</w:t>
-      </w:r>
-      <w:r>
-        <w:rPr>
-          <w:sz w:val="16"/>
-        </w:rPr>
-        <w:t>23411302</w:t>
-      </w:r>
-      <w:r>
-        <w:rPr>
-          <w:sz w:val="16"/>
-        </w:rPr>
-        <w:t>]</w:t>
-      </w:r>
-    </w:p>
-    <w:p>
-      <w:pPr>
-        <w:spacing w:after="0" w:line="240" w:lineRule="auto"/>
-        <w:jc w:val="center"/>
-        <w:rPr>
-          <w:sz w:val="16"/>
-        </w:rPr>
-      </w:pPr>
-      <w:r>
-        <w:rPr>
-          <w:sz w:val="16"/>
-        </w:rPr>
-        <w:t>Cole Ternullo</w:t>
-      </w:r>
-      <w:r>
-        <w:rPr>
-          <w:sz w:val="16"/>
-        </w:rPr>
-        <w:t xml:space="preserve"> [</w:t>
-      </w:r>
-      <w:r>
-        <w:rPr>
-          <w:sz w:val="16"/>
-        </w:rPr>
-        <w:t>23202375</w:t>
-      </w:r>
-      <w:r>
-        <w:rPr>
-          <w:sz w:val="16"/>
-        </w:rPr>
-        <w:t>]</w:t>
-      </w:r>
-    </w:p>
-    <w:p>
-      <w:pPr>
-        <w:spacing w:after="0" w:line="240" w:lineRule="auto"/>
-        <w:jc w:val="center"/>
-        <w:rPr>
-          <w:sz w:val="16"/>
-        </w:rPr>
-        <w:sectPr>
-          <w:type w:val="continuous"/>
-          <w:pgSz w:w="11906" w:h="16838"/>
-          <w:pgMar w:top="1417" w:right="1417" w:bottom="1417" w:left="1417" w:header="720" w:footer="720" w:gutter="0"/>
-          <w:cols w:num="2" w:space="720"/>
-          <w:docGrid w:linePitch="360"/>
-        </w:sectPr>
-      </w:pPr>
-    </w:p>
-    <w:p>
-      <w:pPr>
-        <w:spacing w:after="0" w:line="240" w:lineRule="auto"/>
-        <w:jc w:val="center"/>
-      </w:pPr>
       <w:r>
         <w:rPr>
           <w:sz w:val="16"/>
@@ -277,10 +122,16 @@
       </w:r>
     </w:p>
     <w:p>
+      <w:r>
+        <w:br w:type="page"/>
+      </w:r>
+    </w:p>
+    <w:p>
       <w:pPr>
         <w:pStyle w:val="Heading1"/>
       </w:pPr>
       <w:r>
+        <w:lastRenderedPageBreak/>
         <w:t>Section 2. Traditional Solution</w:t>
       </w:r>
     </w:p>
@@ -290,233 +141,6 @@
           <w:sz w:val="16"/>
         </w:rPr>
         <w:t>Before developing the big data pipeline, we built a single-threaded Python prototype to validate the processing logic and establish performance baselines. This prototype uses no parallelism and processes data using the Pandas library.</w:t>
-      </w:r>
-    </w:p>
-    <w:p>
-      <w:pPr>
-        <w:pStyle w:val="Heading2"/>
-      </w:pPr>
-      <w:r>
-        <w:lastRenderedPageBreak/>
-        <w:t>Environment Setup</w:t>
-      </w:r>
-    </w:p>
-    <w:p>
-      <w:r>
-        <w:rPr>
-          <w:sz w:val="16"/>
-        </w:rPr>
-        <w:t>Development Environment:</w:t>
-      </w:r>
-      <w:r>
-        <w:rPr>
-          <w:sz w:val="16"/>
-        </w:rPr>
-        <w:br/>
-        <w:t>• Hardware: MacBook Air M4 with Apple Silicon, 24 GB unified memory, 512 GB SSD</w:t>
-      </w:r>
-      <w:r>
-        <w:rPr>
-          <w:sz w:val="16"/>
-        </w:rPr>
-        <w:br/>
-        <w:t>• Operating System: macOS Sequoia 15.3</w:t>
-      </w:r>
-      <w:r>
-        <w:rPr>
-          <w:sz w:val="16"/>
-        </w:rPr>
-        <w:br/>
-        <w:t>• Python Version: 3.9.6 (system default)</w:t>
-      </w:r>
-      <w:r>
-        <w:rPr>
-          <w:sz w:val="16"/>
-        </w:rPr>
-        <w:br/>
-        <w:t>• Key Libraries: Pandas 2.3.3, NumPy 1.24.0, PySpark 4.0.2</w:t>
-      </w:r>
-      <w:r>
-        <w:rPr>
-          <w:sz w:val="16"/>
-        </w:rPr>
-        <w:br/>
-      </w:r>
-      <w:r>
-        <w:rPr>
-          <w:sz w:val="16"/>
-        </w:rPr>
-        <w:br/>
-        <w:t>The prototype was developed in a Jupyter notebook environment for interactive exploration, then refactored into standalone Python scripts for reproducibility. All timing measurements use Python's time.time() for wall-clock timing, and memory profiling uses tracemalloc for peak memory tracking.</w:t>
-      </w:r>
-    </w:p>
-    <w:p>
-      <w:pPr>
-        <w:pStyle w:val="Heading2"/>
-      </w:pPr>
-      <w:r>
-        <w:t>Data Sources and Structure</w:t>
-      </w:r>
-    </w:p>
-    <w:p>
-      <w:r>
-        <w:rPr>
-          <w:sz w:val="16"/>
-        </w:rPr>
-        <w:t>ACS Economic Data (DP03):</w:t>
-      </w:r>
-      <w:r>
-        <w:rPr>
-          <w:sz w:val="16"/>
-        </w:rPr>
-        <w:br/>
-        <w:t>The American Community Survey Data Profile 03 contains economic characteristics including employment status, occupation, industry, income, and poverty statistics. Each row represents one county, with 144 columns capturing detailed economic indicators. The data is pre-merged from 51 state-level files into a single CSV for the year 2020. Key columns include:</w:t>
-      </w:r>
-      <w:r>
-        <w:rPr>
-          <w:sz w:val="16"/>
-        </w:rPr>
-        <w:br/>
-        <w:t>• state_fips, county_fips: Geographic identifiers</w:t>
-      </w:r>
-      <w:r>
-        <w:rPr>
-          <w:sz w:val="16"/>
-        </w:rPr>
-        <w:br/>
-        <w:t>• employment_status_population_16_years_and_over: Working-age population</w:t>
-      </w:r>
-      <w:r>
-        <w:rPr>
-          <w:sz w:val="16"/>
-        </w:rPr>
-        <w:br/>
-        <w:t>• income_and_benefits_median_household_income: Median household income</w:t>
-      </w:r>
-      <w:r>
-        <w:rPr>
-          <w:sz w:val="16"/>
-        </w:rPr>
-        <w:br/>
-        <w:t>• percentage_below_poverty_level: Poverty rate</w:t>
-      </w:r>
-      <w:r>
-        <w:rPr>
-          <w:sz w:val="16"/>
-        </w:rPr>
-        <w:br/>
-      </w:r>
-      <w:r>
-        <w:rPr>
-          <w:sz w:val="16"/>
-        </w:rPr>
-        <w:br/>
-        <w:t>Presidential Voting Data:</w:t>
-      </w:r>
-      <w:r>
-        <w:rPr>
-          <w:sz w:val="16"/>
-        </w:rPr>
-        <w:br/>
-        <w:t>County-level election results from MIT Election Data + Science Lab, containing vote counts by candidate, party, and county for all presidential elections 2000-2024. The data is in long format with 94,019 rows (multiple candidates per county per election). Key columns include:</w:t>
-      </w:r>
-      <w:r>
-        <w:rPr>
-          <w:sz w:val="16"/>
-        </w:rPr>
-        <w:br/>
-        <w:t>• year: Election year (2000, 2004, 2008, 2012, 2016, 2020, 2024)</w:t>
-      </w:r>
-      <w:r>
-        <w:rPr>
-          <w:sz w:val="16"/>
-        </w:rPr>
-        <w:br/>
-        <w:t>• county_fips: 5-digit FIPS code</w:t>
-      </w:r>
-      <w:r>
-        <w:rPr>
-          <w:sz w:val="16"/>
-        </w:rPr>
-        <w:br/>
-        <w:t>• candidate, party: Candidate name and party affiliation</w:t>
-      </w:r>
-      <w:r>
-        <w:rPr>
-          <w:sz w:val="16"/>
-        </w:rPr>
-        <w:br/>
-        <w:t>• candidatevotes, totalvotes: Vote counts</w:t>
-      </w:r>
-    </w:p>
-    <w:p>
-      <w:pPr>
-        <w:pStyle w:val="Heading2"/>
-      </w:pPr>
-      <w:r>
-        <w:t>Processing Pipeline Overview</w:t>
-      </w:r>
-    </w:p>
-    <w:p>
-      <w:r>
-        <w:rPr>
-          <w:sz w:val="16"/>
-        </w:rPr>
-        <w:t>The traditional solution follows a five-step ETL (Extract, Transform, Load) pipeline:</w:t>
-      </w:r>
-      <w:r>
-        <w:rPr>
-          <w:sz w:val="16"/>
-        </w:rPr>
-        <w:br/>
-      </w:r>
-      <w:r>
-        <w:rPr>
-          <w:sz w:val="16"/>
-        </w:rPr>
-        <w:br/>
-        <w:t>1. Extract: Load raw CSV files into Pandas DataFrames</w:t>
-      </w:r>
-      <w:r>
-        <w:rPr>
-          <w:sz w:val="16"/>
-        </w:rPr>
-        <w:br/>
-        <w:t>2. Transform: Filter by year, standardize FIPS codes, identify election winners</w:t>
-      </w:r>
-      <w:r>
-        <w:rPr>
-          <w:sz w:val="16"/>
-        </w:rPr>
-        <w:br/>
-        <w:t>3. Load: Merge datasets on common key (FIPS code)</w:t>
-      </w:r>
-      <w:r>
-        <w:rPr>
-          <w:sz w:val="16"/>
-        </w:rPr>
-        <w:br/>
-        <w:t>4. Analyze: Aggregate statistics by winning party</w:t>
-      </w:r>
-      <w:r>
-        <w:rPr>
-          <w:sz w:val="16"/>
-        </w:rPr>
-        <w:br/>
-        <w:t>5. Output: Generate summary tables and visualizations</w:t>
-      </w:r>
-      <w:r>
-        <w:rPr>
-          <w:sz w:val="16"/>
-        </w:rPr>
-        <w:br/>
-      </w:r>
-      <w:r>
-        <w:rPr>
-          <w:sz w:val="16"/>
-        </w:rPr>
-        <w:br/>
-        <w:t>This pipeline is entirely sequential—each step must complete before the next begins. The CPU utilization during execution shows a single core at 100% while other cores remain idle, demonstrating the limitation of single-threaded processing.</w:t>
       </w:r>
     </w:p>
     <w:p>
@@ -639,7 +263,6 @@
           <w:rFonts w:ascii="Courier New" w:hAnsi="Courier New"/>
           <w:sz w:val="16"/>
         </w:rPr>
-        <w:lastRenderedPageBreak/>
         <w:t>start = time.time()</w:t>
       </w:r>
       <w:r>
@@ -912,6 +535,7 @@
               <w:rPr>
                 <w:sz w:val="16"/>
               </w:rPr>
+              <w:lastRenderedPageBreak/>
               <w:t>DEMOCRAT</w:t>
             </w:r>
           </w:p>
@@ -1282,180 +906,17 @@
       </w:r>
     </w:p>
     <w:p>
-      <w:pPr>
-        <w:pStyle w:val="Heading2"/>
-      </w:pPr>
       <w:r>
-        <w:t>Limitations of Traditional Approach</w:t>
+        <w:br w:type="page"/>
       </w:r>
     </w:p>
-    <w:p>
-      <w:r>
-        <w:rPr>
-          <w:sz w:val="16"/>
-        </w:rPr>
-        <w:t>While the prototype successfully produces correct results, it exhibits several limitations that become critical at scale:</w:t>
-      </w:r>
-      <w:r>
-        <w:rPr>
-          <w:sz w:val="16"/>
-        </w:rPr>
-        <w:br/>
-      </w:r>
-      <w:r>
-        <w:rPr>
-          <w:sz w:val="16"/>
-        </w:rPr>
-        <w:br/>
-        <w:t>Single-Threaded Execution:</w:t>
-      </w:r>
-      <w:r>
-        <w:rPr>
-          <w:sz w:val="16"/>
-        </w:rPr>
-        <w:br/>
-        <w:t>The entire pipeline runs on a single CPU core. On our 8-core M4 processor, this means 87.5% of available compute capacity sits idle. For I/O-bound operations like CSV parsing, this is particularly wasteful since the CPU spends most of its time waiting for disk reads.</w:t>
-      </w:r>
-      <w:r>
-        <w:rPr>
-          <w:sz w:val="16"/>
-        </w:rPr>
-        <w:br/>
-      </w:r>
-      <w:r>
-        <w:rPr>
-          <w:sz w:val="16"/>
-        </w:rPr>
-        <w:br/>
-        <w:t>Memory Pressure:</w:t>
-      </w:r>
-      <w:r>
-        <w:rPr>
-          <w:sz w:val="16"/>
-        </w:rPr>
-        <w:br/>
-        <w:t>Pandas loads entire datasets into memory before processing. With 67 MB peak usage for just 2020 data, scaling to all 15 years (2009-2023) would require ~1 GB of RAM. Join operations create temporary copies, potentially doubling memory requirements. On systems with limited RAM, this leads to swap thrashing.</w:t>
-      </w:r>
-      <w:r>
-        <w:rPr>
-          <w:sz w:val="16"/>
-        </w:rPr>
-        <w:br/>
-      </w:r>
-      <w:r>
-        <w:rPr>
-          <w:sz w:val="16"/>
-        </w:rPr>
-        <w:lastRenderedPageBreak/>
-        <w:br/>
-        <w:t>No Fault Tolerance:</w:t>
-      </w:r>
-      <w:r>
-        <w:rPr>
-          <w:sz w:val="16"/>
-        </w:rPr>
-        <w:br/>
-        <w:t>If the process crashes mid-execution (e.g., out of memory), all progress is lost. There is no checkpointing or recovery mechanism. For long-running jobs on large datasets, this is unacceptable.</w:t>
-      </w:r>
-      <w:r>
-        <w:rPr>
-          <w:sz w:val="16"/>
-        </w:rPr>
-        <w:br/>
-      </w:r>
-      <w:r>
-        <w:rPr>
-          <w:sz w:val="16"/>
-        </w:rPr>
-        <w:br/>
-        <w:t>Sequential I/O:</w:t>
-      </w:r>
-      <w:r>
-        <w:rPr>
-          <w:sz w:val="16"/>
-        </w:rPr>
-        <w:br/>
-        <w:t>Reading 3,060 individual CSV files sequentially creates an I/O bottleneck. Modern SSDs can handle parallel reads efficiently, but single-threaded Pandas cannot exploit this capability.</w:t>
-      </w:r>
-    </w:p>
-    <w:p>
-      <w:pPr>
-        <w:pStyle w:val="Heading2"/>
-      </w:pPr>
-      <w:r>
-        <w:t>Motivation for MapReduce</w:t>
-      </w:r>
-    </w:p>
-    <w:p>
-      <w:pPr>
-        <w:rPr>
-          <w:sz w:val="16"/>
-        </w:rPr>
-      </w:pPr>
-      <w:r>
-        <w:rPr>
-          <w:sz w:val="16"/>
-        </w:rPr>
-        <w:t>The limitations above motivate a transition to a distributed computing framework. MapReduce, implemented via Apache Spark, addresses each limitation:</w:t>
-      </w:r>
-      <w:r>
-        <w:rPr>
-          <w:sz w:val="16"/>
-        </w:rPr>
-        <w:br/>
-      </w:r>
-      <w:r>
-        <w:rPr>
-          <w:sz w:val="16"/>
-        </w:rPr>
-        <w:br/>
-        <w:t>• Parallelism: Spark distributes work across all available cores (and machines in a cluster)</w:t>
-      </w:r>
-      <w:r>
-        <w:rPr>
-          <w:sz w:val="16"/>
-        </w:rPr>
-        <w:br/>
-        <w:t>• Memory Management: RDDs (Resilient Distributed Datasets) spill to disk when memory is exhausted</w:t>
-      </w:r>
-      <w:r>
-        <w:rPr>
-          <w:sz w:val="16"/>
-        </w:rPr>
-        <w:br/>
-        <w:t>• Fault Tolerance: Spark tracks RDD lineage and can recompute lost partitions automatically</w:t>
-      </w:r>
-      <w:r>
-        <w:rPr>
-          <w:sz w:val="16"/>
-        </w:rPr>
-        <w:br/>
-        <w:t>• Parallel I/O: Each Spark executor reads its assigned file partitions independently</w:t>
-      </w:r>
-      <w:r>
-        <w:rPr>
-          <w:sz w:val="16"/>
-        </w:rPr>
-        <w:br/>
-      </w:r>
-      <w:r>
-        <w:rPr>
-          <w:sz w:val="16"/>
-        </w:rPr>
-        <w:br/>
-        <w:t>The key insight is that our workload is "embarrassingly parallel" at the file level—each of the 3,060 ACS files can be processed independently before the final aggregation. This is the ideal use case for MapReduce: independent map operations followed by a shuffle and reduce.</w:t>
-      </w:r>
-    </w:p>
-    <w:p/>
     <w:p>
       <w:pPr>
         <w:pStyle w:val="Heading1"/>
       </w:pPr>
       <w:r>
-        <w:t xml:space="preserve">Section 3. MapReduce </w:t>
-      </w:r>
-      <w:r>
-        <w:t>Optimization</w:t>
+        <w:lastRenderedPageBreak/>
+        <w:t>Section 3. MapReduce Optimisation</w:t>
       </w:r>
     </w:p>
     <w:p>
@@ -1660,13 +1121,6 @@
           <w:sz w:val="16"/>
         </w:rPr>
         <w:br/>
-      </w:r>
-      <w:r>
-        <w:rPr>
-          <w:rFonts w:ascii="Courier New" w:hAnsi="Courier New"/>
-          <w:sz w:val="16"/>
-        </w:rPr>
-        <w:lastRenderedPageBreak/>
         <w:t xml:space="preserve">    votes = int(float(fields[8])) if fields[8].strip() else 0</w:t>
       </w:r>
       <w:r>
@@ -1867,6 +1321,13 @@
           <w:sz w:val="16"/>
         </w:rPr>
         <w:br/>
+      </w:r>
+      <w:r>
+        <w:rPr>
+          <w:rFonts w:ascii="Courier New" w:hAnsi="Courier New"/>
+          <w:sz w:val="16"/>
+        </w:rPr>
+        <w:lastRenderedPageBreak/>
         <w:t>party_counts = merged_rdd.map(lambda x: (x[1]['winning_party'], 1))\</w:t>
       </w:r>
       <w:r>
@@ -2380,12 +1841,6 @@
           <w:sz w:val="16"/>
         </w:rPr>
         <w:br/>
-      </w:r>
-      <w:r>
-        <w:rPr>
-          <w:sz w:val="16"/>
-        </w:rPr>
-        <w:lastRenderedPageBreak/>
         <w:t>Key Insight: MapReduce overhead is amortized over larger datasets. For datasets &gt;50MB, Spark RDD provides significant speedup. The crossover point is approximately 30-50MB.</w:t>
       </w:r>
     </w:p>
@@ -2731,7 +2186,6 @@
       </w:r>
     </w:p>
     <w:sectPr>
-      <w:type w:val="continuous"/>
       <w:pgSz w:w="11906" w:h="16838"/>
       <w:pgMar w:top="1417" w:right="1417" w:bottom="1417" w:left="1417" w:header="720" w:footer="720" w:gutter="0"/>
       <w:cols w:space="720"/>
@@ -2914,31 +2368,31 @@
       </w:rPr>
     </w:lvl>
   </w:abstractNum>
-  <w:num w:numId="1" w16cid:durableId="99763439">
+  <w:num w:numId="1" w16cid:durableId="174923271">
     <w:abstractNumId w:val="8"/>
   </w:num>
-  <w:num w:numId="2" w16cid:durableId="850797400">
+  <w:num w:numId="2" w16cid:durableId="1942880992">
     <w:abstractNumId w:val="6"/>
   </w:num>
-  <w:num w:numId="3" w16cid:durableId="2027323164">
+  <w:num w:numId="3" w16cid:durableId="1421559408">
     <w:abstractNumId w:val="5"/>
   </w:num>
-  <w:num w:numId="4" w16cid:durableId="270551529">
+  <w:num w:numId="4" w16cid:durableId="498039860">
     <w:abstractNumId w:val="4"/>
   </w:num>
-  <w:num w:numId="5" w16cid:durableId="236326758">
+  <w:num w:numId="5" w16cid:durableId="1180001156">
     <w:abstractNumId w:val="7"/>
   </w:num>
-  <w:num w:numId="6" w16cid:durableId="455879997">
+  <w:num w:numId="6" w16cid:durableId="1613584338">
     <w:abstractNumId w:val="3"/>
   </w:num>
-  <w:num w:numId="7" w16cid:durableId="285352587">
+  <w:num w:numId="7" w16cid:durableId="1717463475">
     <w:abstractNumId w:val="2"/>
   </w:num>
-  <w:num w:numId="8" w16cid:durableId="75833285">
+  <w:num w:numId="8" w16cid:durableId="1145778484">
     <w:abstractNumId w:val="1"/>
   </w:num>
-  <w:num w:numId="9" w16cid:durableId="138159737">
+  <w:num w:numId="9" w16cid:durableId="1036194793">
     <w:abstractNumId w:val="0"/>
   </w:num>
 </w:numbering>

</xml_diff>